<commit_message>
Ti3C2O2 lattice constant and metallic character from own PBE-D3 primitive-cell calculation; drop unverified Khazaei 2013 citation
Co-Authored-By: Claude Opus 5.5 <noreply@anthropic.com>
</commit_message>
<xml_diff>
--- a/manuscript/journal_package/Cover_Letter.docx
+++ b/manuscript/journal_package/Cover_Letter.docx
@@ -45,7 +45,7 @@
       </w:pPr>
       <w:r>
         <w:rPr/>
-        <w:t>27 September 2026</w:t>
+        <w:t>29 September 2026</w:t>
       </w:r>
     </w:p>
     <w:p>
@@ -164,7 +164,7 @@
       </w:r>
       <w:r>
         <w:rPr/>
-        <w:t xml:space="preserve"> MXene proposed as a carrier. Two results concern methods that are widely used in screens of this kind. First, every docking mode of two redocking controls was compared with the crystal pose: the crystal-like erlotinib pose is found (≤ 1.44 Å) but is not ranked first (5.9 and 7.6 Å), so the docking scores are reported as exploratory. Second, the GFN2-xTB and GFN1-xTB tight-binding methods fail for this metallic carrier: GFN2-xTB places the lattice minimum at 2.70 Å instead of 3.03 Å, GFN1-xTB has no minimum, and only 1 of 18 attempts on neutral finite flakes converged. Adsorption was therefore computed with periodic density functional theory (PBE-D3). [DFT RESULT SENTENCE ADDED AUTOMATICALLY WHEN THE CAMPAIGN IS COMPLETE.] A descriptor model of the docking score, validated by nested cross-validation and Y-scrambling, is weak (</w:t>
+        <w:t xml:space="preserve"> MXene proposed as a carrier. Two results concern methods that are widely used in screens of this kind. First, every docking mode of two redocking controls was compared with the crystal pose: the crystal-like erlotinib pose is found (≤ 1.44 Å) but is not ranked first (5.9 and 7.6 Å), so the docking scores are reported as exploratory. Second, the GFN2-xTB and GFN1-xTB tight-binding methods fail for this metallic carrier: GFN2-xTB places the lattice minimum at 2.70 Å instead of about 3.03 Å (PBE-D3), GFN1-xTB has no minimum, and only 1 of 18 attempts on neutral finite flakes converged. Adsorption was therefore computed with periodic density functional theory (PBE-D3). [DFT RESULT SENTENCE ADDED AUTOMATICALLY WHEN THE CAMPAIGN IS COMPLETE.] A descriptor model of the docking score, validated by nested cross-validation and Y-scrambling, is weak (</w:t>
       </w:r>
       <w:r>
         <w:rPr>
@@ -195,7 +195,7 @@
       </w:pPr>
       <w:r>
         <w:rPr/>
-        <w:t>Related work. Supporting files of an earlier version of this study were deposited on Zenodo (https://doi.org/10.5281/zenodo.22700227); that version was superseded when the study was rebuilt from its raw inputs, and the results reported here replace it. A methods paper by the author, in preparation for the Journal of Chemical Information and Modeling, uses this study as one of four case studies of errors found and corrected during such rebuilds, and cites some of its summary numbers; the study, including its docking and DFT adsorption results, is reported in full only in this manuscript.</w:t>
+        <w:t>Related work. Supporting files of an earlier version of this study were deposited on Zenodo (https://doi.org/10.5281/zenodo.22700227); that version was superseded when the study was rebuilt from its raw inputs, and the results reported here replace it. A methods paper by the author, in preparation, uses this study as one of four case studies of errors found and corrected during such rebuilds, and cites some of its summary numbers; the study, including its docking and DFT adsorption results, is reported in full only in this manuscript.</w:t>
       </w:r>
     </w:p>
     <w:p>

</xml_diff>